<commit_message>
Clin Path I Exam 2: S. aureus is acute, not subacute, endocarditis
Slide 57 lists Staphylococcus aureus among the "less virulent" organisms
of subacute infective endocarditis; the guide told students to "answer
from the slide if asked in the slide's terms". Under the 2026-09-28 truth
rule the guide and cram sheet now teach the accurate version (S. aureus is
highly virulent, the classic cause of ACUTE endocarditis on a normal valve;
subacute is typically streptococcal on a damaged valve; Robbins, the course
text) with the slide's wording noted. No quiz keys the slide's version
(checked: the only subacute items key streptococci / valve damage /
Candida as a less virulent cause), so no question changed.

Guide + cram sources edited alongside the pages (cram builder reproduces
the edited sheet apart from the docx link it never emits); .docx copies
and the CP E2 cram-personal file regenerated.

Co-Authored-By: Claude Opus 5.5 (1M context) <noreply@anthropic.com>
</commit_message>
<xml_diff>
--- a/Clinical Pathophysiology I Exam 2/cp-exam-2-study-guide.docx
+++ b/Clinical Pathophysiology I Exam 2/cp-exam-2-study-guide.docx
@@ -7238,7 +7238,7 @@
                 <w:i w:val="0"/>
                 <w:sz w:val="18"/>
               </w:rPr>
-              <w:t xml:space="preserve"> — the slide lists </w:t>
+              <w:t xml:space="preserve"> (typically </w:t>
             </w:r>
             <w:r>
               <w:rPr>
@@ -7246,7 +7246,7 @@
                 <w:i/>
                 <w:sz w:val="18"/>
               </w:rPr>
-              <w:t>S. aureus</w:t>
+              <w:t>Streptococcus</w:t>
             </w:r>
             <w:r>
               <w:rPr>
@@ -7254,7 +7254,23 @@
                 <w:i w:val="0"/>
                 <w:sz w:val="18"/>
               </w:rPr>
-              <w:t xml:space="preserve">, </w:t>
+              <w:t xml:space="preserve">) and are </w:t>
+            </w:r>
+            <w:r>
+              <w:rPr>
+                <w:b/>
+                <w:i w:val="0"/>
+                <w:sz w:val="18"/>
+              </w:rPr>
+              <w:t>not virulent enough to attack a healthy endocardium</w:t>
+            </w:r>
+            <w:r>
+              <w:rPr>
+                <w:b w:val="0"/>
+                <w:i w:val="0"/>
+                <w:sz w:val="18"/>
+              </w:rPr>
+              <w:t xml:space="preserve">; the damaged valve is what lets them in. The slide also lists </w:t>
             </w:r>
             <w:r>
               <w:rPr>
@@ -7262,7 +7278,7 @@
                 <w:i/>
                 <w:sz w:val="18"/>
               </w:rPr>
-              <w:t>Streptococcus</w:t>
+              <w:t>S. aureus</w:t>
             </w:r>
             <w:r>
               <w:rPr>
@@ -7286,23 +7302,23 @@
                 <w:i w:val="0"/>
                 <w:sz w:val="18"/>
               </w:rPr>
-              <w:t xml:space="preserve"> — and are </w:t>
-            </w:r>
-            <w:r>
-              <w:rPr>
-                <w:b/>
-                <w:i w:val="0"/>
-                <w:sz w:val="18"/>
-              </w:rPr>
-              <w:t>not virulent enough to attack a healthy endocardium</w:t>
+              <w:t xml:space="preserve">; </w:t>
             </w:r>
             <w:r>
               <w:rPr>
                 <w:b w:val="0"/>
-                <w:i w:val="0"/>
-                <w:sz w:val="18"/>
-              </w:rPr>
-              <w:t>; the damaged valve is what lets them in.</w:t>
+                <w:i/>
+                <w:sz w:val="18"/>
+              </w:rPr>
+              <w:t>S. aureus</w:t>
+            </w:r>
+            <w:r>
+              <w:rPr>
+                <w:b w:val="0"/>
+                <w:i w:val="0"/>
+                <w:sz w:val="18"/>
+              </w:rPr>
+              <w:t xml:space="preserve"> belongs with the acute form (see the note below).</w:t>
             </w:r>
           </w:p>
         </w:tc>
@@ -7509,14 +7525,14 @@
                 <w:b/>
                 <w:i w:val="0"/>
               </w:rPr>
-              <w:t>Check against the textbook.</w:t>
+              <w:t>Slide 57 is not accurate here.</w:t>
             </w:r>
             <w:r>
               <w:rPr>
                 <w:b w:val="0"/>
                 <w:i w:val="0"/>
               </w:rPr>
-              <w:t xml:space="preserve"> Slide 57 lists </w:t>
+              <w:t xml:space="preserve"> It lists </w:t>
             </w:r>
             <w:r>
               <w:rPr>
@@ -7544,7 +7560,7 @@
                 <w:b w:val="0"/>
                 <w:i w:val="0"/>
               </w:rPr>
-              <w:t xml:space="preserve"> endocarditis. The course text, Robbins, generally pairs highly virulent organisms such as </w:t>
+              <w:t xml:space="preserve"> endocarditis. </w:t>
             </w:r>
             <w:r>
               <w:rPr>
@@ -7558,7 +7574,21 @@
                 <w:b w:val="0"/>
                 <w:i w:val="0"/>
               </w:rPr>
-              <w:t xml:space="preserve"> with the acute form. Answer from the slide if asked in the slide’s terms, and know the general rule: the less virulent the organism, the more it depends on an already-damaged valve.</w:t>
+              <w:t xml:space="preserve"> is highly virulent: it is the classic cause of </w:t>
+            </w:r>
+            <w:r>
+              <w:rPr>
+                <w:b/>
+                <w:i w:val="0"/>
+              </w:rPr>
+              <w:t>acute</w:t>
+            </w:r>
+            <w:r>
+              <w:rPr>
+                <w:b w:val="0"/>
+                <w:i w:val="0"/>
+              </w:rPr>
+              <w:t xml:space="preserve"> endocarditis and can attack a normal valve (Robbins, the course text). Subacute endocarditis is typically streptococcal, on a damaged valve. The general rule holds: the less virulent the organism, the more it depends on an already-damaged valve.</w:t>
             </w:r>
           </w:p>
         </w:tc>

</xml_diff>